<commit_message>
Improve md_to_docx for Google Docs: paragraph spacing, table styling, and full-width tables
- Add BodyText/FirstParagraph/Normal paragraph spacing (10pt after) to
  reference doc so paragraphs don't run together in Google Docs
- Add Table style with bold firstRow + thick bottom border for headers
- Add explicit page dimensions (Letter, 1" margins) to reference doc
- Use --columns=1 so pandoc always derives column widths from dash ratios
- Add postprocess script to scale table gridCol widths from pandoc's
  hardcoded 5.5" to the actual 6.5" text width (fixes narrow tables in
  Google Docs while keeping tblW at 100% for Word compatibility)
- Add table column alignment section to style guide
- Add example document with aligned/centered table columns

Co-Authored-By: Claude Opus 4.6 (1M context) <noreply@anthropic.com>
</commit_message>
<xml_diff>
--- a/md/md_to_docx_reference.docx
+++ b/md/md_to_docx_reference.docx
@@ -1,6 +1,6 @@
 
 <file path=word/document.xml><?xml version="1.0" encoding="utf-8"?>
-<w:document xmlns:w="http://schemas.openxmlformats.org/wordprocessingml/2006/main" xmlns:m="http://schemas.openxmlformats.org/officeDocument/2006/math" xmlns:r="http://schemas.openxmlformats.org/officeDocument/2006/relationships" xmlns:o="urn:schemas-microsoft-com:office:office" xmlns:v="urn:schemas-microsoft-com:vml" xmlns:w10="urn:schemas-microsoft-com:office:word" xmlns:a="http://schemas.openxmlformats.org/drawingml/2006/main" xmlns:pic="http://schemas.openxmlformats.org/drawingml/2006/picture" xmlns:wp="http://schemas.openxmlformats.org/drawingml/2006/wordprocessingDrawing">
+<w:document xmlns:r="http://schemas.openxmlformats.org/officeDocument/2006/relationships" xmlns:w="http://schemas.openxmlformats.org/wordprocessingml/2006/main">
   <w:body>
     <w:p>
       <w:pPr>
@@ -317,6 +317,8 @@
       <w:footnotePr>
         <w:numRestart w:val="eachSect"/>
       </w:footnotePr>
+      <w:pgSz w:w="12240" w:h="15840"/>
+      <w:pgMar w:top="1440" w:right="1440" w:bottom="1440" w:left="1440" w:header="720" w:footer="720"/>
     </w:sectPr>
   </w:body>
 </w:document>
@@ -481,7 +483,7 @@
 </file>
 
 <file path=word/styles.xml><?xml version="1.0" encoding="utf-8"?>
-<w:styles xmlns:mc="http://schemas.openxmlformats.org/markup-compatibility/2006" xmlns:o="urn:schemas-microsoft-com:office:office" xmlns:r="http://schemas.openxmlformats.org/officeDocument/2006/relationships" xmlns:m="http://schemas.openxmlformats.org/officeDocument/2006/math" xmlns:v="urn:schemas-microsoft-com:vml" xmlns:wp="http://schemas.openxmlformats.org/drawingml/2006/wordprocessingDrawing" xmlns:w10="urn:schemas-microsoft-com:office:word" xmlns:w="http://schemas.openxmlformats.org/wordprocessingml/2006/main" xmlns:wne="http://schemas.microsoft.com/office/word/2006/wordml" xmlns:sl="http://schemas.openxmlformats.org/schemaLibrary/2006/main" xmlns:a="http://schemas.openxmlformats.org/drawingml/2006/main" xmlns:pic="http://schemas.openxmlformats.org/drawingml/2006/picture" xmlns:c="http://schemas.openxmlformats.org/drawingml/2006/chart" xmlns:lc="http://schemas.openxmlformats.org/drawingml/2006/lockedCanvas" xmlns:dgm="http://schemas.openxmlformats.org/drawingml/2006/diagram" xmlns:wps="http://schemas.microsoft.com/office/word/2010/wordprocessingShape" xmlns:wpg="http://schemas.microsoft.com/office/word/2010/wordprocessingGroup" xmlns:w14="http://schemas.microsoft.com/office/word/2010/wordml" xmlns:w15="http://schemas.microsoft.com/office/word/2012/wordml" xmlns:w16="http://schemas.microsoft.com/office/word/2018/wordml" xmlns:w16cex="http://schemas.microsoft.com/office/word/2018/wordml/cex" xmlns:w16cid="http://schemas.microsoft.com/office/word/2016/wordml/cid" xmlns="http://schemas.microsoft.com/office/tasks/2019/documenttasks" xmlns:cr="http://schemas.microsoft.com/office/comments/2020/reactions">
+<w:styles xmlns:w="http://schemas.openxmlformats.org/wordprocessingml/2006/main">
   <w:docDefaults>
     <w:rPrDefault>
       <w:rPr>
@@ -508,6 +510,9 @@
   </w:style>
   <w:style w:type="paragraph" w:styleId="Normal" w:default="1">
     <w:name w:val="normal"/>
+    <w:pPr>
+      <w:spacing w:after="200" w:before="0"/>
+    </w:pPr>
   </w:style>
   <w:style w:type="paragraph" w:styleId="Heading1">
     <w:name w:val="heading 1"/>
@@ -642,6 +647,35 @@
       <w:sz w:val="30"/>
       <w:szCs w:val="30"/>
     </w:rPr>
+  </w:style>
+  <w:style w:type="paragraph" w:styleId="BodyText">
+    <w:name w:val="Body Text"/>
+    <w:basedOn w:val="Normal"/>
+    <w:pPr>
+      <w:spacing w:after="200" w:before="0"/>
+    </w:pPr>
+  </w:style>
+  <w:style w:type="paragraph" w:styleId="FirstParagraph">
+    <w:name w:val="First Paragraph"/>
+    <w:basedOn w:val="BodyText"/>
+    <w:pPr>
+      <w:spacing w:after="200" w:before="0"/>
+    </w:pPr>
+  </w:style>
+  <w:style w:type="table" w:styleId="Table">
+    <w:name w:val="Table"/>
+    <w:basedOn w:val="TableNormal"/>
+    <w:tblPr/>
+    <w:tblStylePr w:type="firstRow">
+      <w:rPr>
+        <w:b/>
+      </w:rPr>
+      <w:tcPr>
+        <w:tcBorders>
+          <w:bottom w:val="single" w:sz="12" w:space="0" w:color="000000"/>
+        </w:tcBorders>
+      </w:tcPr>
+    </w:tblStylePr>
   </w:style>
 </w:styles>
 </file>

</xml_diff>

<commit_message>
Style blockquotes and code blocks for Google Docs with padding and backgrounds
- Add BlockText style (blue background, blue left border, indent) and
  SourceCode style (gray background, invisible left border for indent) to
  the reference docx
- Fix namespace preservation in postprocessor (ET.write was mangling w: to
  ns0:, breaking docx-to-md round-trip)
- Add spacer paragraph insertion for visual padding inside shaded blocks,
  since Google Docs ignores style-level and direct paragraph spacing
- Add spacing-before on paragraphs following shaded blocks
- Update style guide with blockquote example and nested blockquote warning

Co-Authored-By: Claude Opus 4.6 (1M context) <noreply@anthropic.com>
</commit_message>
<xml_diff>
--- a/md/md_to_docx_reference.docx
+++ b/md/md_to_docx_reference.docx
@@ -676,6 +676,30 @@
         </w:tcBorders>
       </w:tcPr>
     </w:tblStylePr>
+  </w:style>
+  <w:style w:type="paragraph" w:styleId="BlockText">
+    <w:name w:val="Block Text"/>
+    <w:basedOn w:val="Normal"/>
+    <w:pPr>
+      <w:ind w:left="480" w:right="480" w:firstLine="0"/>
+      <w:spacing w:before="100" w:after="100"/>
+      <w:shd w:val="clear" w:color="auto" w:fill="DBEAFE"/>
+      <w:pBdr>
+        <w:left w:val="single" w:sz="18" w:space="8" w:color="93C5FD"/>
+      </w:pBdr>
+    </w:pPr>
+  </w:style>
+  <w:style w:type="paragraph" w:styleId="SourceCode">
+    <w:name w:val="Source Code"/>
+    <w:basedOn w:val="Normal"/>
+    <w:pPr>
+      <w:ind w:left="240" w:right="240" w:firstLine="0"/>
+      <w:spacing w:before="100" w:after="100"/>
+      <w:shd w:val="clear" w:color="auto" w:fill="F2F2F2"/>
+      <w:pBdr>
+        <w:left w:val="single" w:sz="18" w:space="8" w:color="F2F2F2"/>
+      </w:pBdr>
+    </w:pPr>
   </w:style>
 </w:styles>
 </file>

</xml_diff>